<commit_message>
Deploying to gh-pages from @ Morrison-Lab/mds@7a6531ca8821ff2810527bd8d1fba978f282d10d 🚀
</commit_message>
<xml_diff>
--- a/optimization-critical-points.docx
+++ b/optimization-critical-points.docx
@@ -15,10 +15,10 @@
         <w:pStyle w:val="Date"/>
       </w:pPr>
       <w:r>
-        <w:t xml:space="preserve">Last modified: 2026-10-29 16:45:03 (PDT)</w:t>
+        <w:t xml:space="preserve">Last modified: 2026-10-29 20:01:11 (PDT)</w:t>
       </w:r>
     </w:p>
-    <w:bookmarkStart w:id="89" w:name="sec-critical-points"/>
+    <w:bookmarkStart w:id="90" w:name="sec-critical-points"/>
     <w:p>
       <w:pPr>
         <w:pStyle w:val="Heading2"/>
@@ -14839,124 +14839,24 @@
       </w:r>
     </w:p>
     <w:bookmarkEnd w:id="73"/>
-    <w:bookmarkStart w:id="74" w:name="def-inflection-point"/>
+    <w:bookmarkStart w:id="74" w:name="rem-second-derivative-test-zero"/>
     <w:p>
       <w:pPr>
         <w:pStyle w:val="BodyText"/>
       </w:pPr>
       <w:r>
         <w:rPr>
-          <w:b/>
-          <w:bCs/>
-        </w:rPr>
-        <w:t xml:space="preserve">Definition 3 (Inflection point)</w:t>
-      </w:r>
-      <w:r>
-        <w:t xml:space="preserve"> </w:t>
-      </w:r>
-      <w:r>
-        <w:t xml:space="preserve">An</w:t>
-      </w:r>
-      <w:r>
-        <w:t xml:space="preserve"> </w:t>
-      </w:r>
-      <w:r>
-        <w:rPr>
-          <w:b/>
-          <w:bCs/>
-        </w:rPr>
-        <w:t xml:space="preserve">inflection point</w:t>
-      </w:r>
-      <w:r>
-        <w:t xml:space="preserve"> </w:t>
-      </w:r>
-      <w:r>
-        <w:t xml:space="preserve">of a</w:t>
-      </w:r>
-      <w:r>
-        <w:t xml:space="preserve"> </w:t>
-      </w:r>
-      <w:hyperlink r:id="rId22">
-        <w:r>
-          <w:rPr>
-            <w:rStyle w:val="Hyperlink"/>
-          </w:rPr>
-          <w:t xml:space="preserve">function</w:t>
-        </w:r>
-      </w:hyperlink>
-      <w:r>
-        <w:t xml:space="preserve"> </w:t>
-      </w:r>
-      <m:oMath>
-        <m:r>
-          <m:t>f</m:t>
-        </m:r>
-      </m:oMath>
-      <w:r>
-        <w:t xml:space="preserve"> </w:t>
-      </w:r>
-      <w:r>
-        <w:t xml:space="preserve">is a point</w:t>
-      </w:r>
-      <w:r>
-        <w:t xml:space="preserve"> </w:t>
-      </w:r>
-      <m:oMath>
-        <m:r>
-          <m:t>c</m:t>
-        </m:r>
-      </m:oMath>
-      <w:r>
-        <w:t xml:space="preserve"> </w:t>
-      </w:r>
-      <w:r>
-        <w:t xml:space="preserve">such that, on some</w:t>
-      </w:r>
-      <w:r>
-        <w:t xml:space="preserve"> </w:t>
-      </w:r>
-      <w:hyperlink r:id="rId14">
-        <w:r>
-          <w:rPr>
-            <w:rStyle w:val="Hyperlink"/>
-          </w:rPr>
-          <w:t xml:space="preserve">open interval</w:t>
-        </w:r>
-      </w:hyperlink>
-      <w:r>
-        <w:t xml:space="preserve"> </w:t>
-      </w:r>
-      <w:r>
-        <w:t xml:space="preserve">around</w:t>
-      </w:r>
-      <w:r>
-        <w:t xml:space="preserve"> </w:t>
-      </w:r>
-      <m:oMath>
-        <m:r>
-          <m:t>c</m:t>
-        </m:r>
-      </m:oMath>
-      <w:r>
-        <w:t xml:space="preserve">,</w:t>
-      </w:r>
-      <w:r>
-        <w:t xml:space="preserve"> </w:t>
-      </w:r>
-      <w:r>
-        <w:t xml:space="preserve">the</w:t>
-      </w:r>
-      <w:r>
-        <w:t xml:space="preserve"> </w:t>
-      </w:r>
-      <w:hyperlink r:id="rId69">
-        <w:r>
-          <w:rPr>
-            <w:rStyle w:val="Hyperlink"/>
-          </w:rPr>
-          <w:t xml:space="preserve">second derivative</w:t>
-        </w:r>
-      </w:hyperlink>
+          <w:i/>
+          <w:iCs/>
+        </w:rPr>
+        <w:t xml:space="preserve">Remark 1</w:t>
+      </w:r>
+      <w:r>
+        <w:t xml:space="preserve"> (The second derivative test can fail to decide). </w:t>
+      </w:r>
+      <w:r>
+        <w:t xml:space="preserve">If</w:t>
+      </w:r>
       <w:r>
         <w:t xml:space="preserve"> </w:t>
       </w:r>
@@ -14976,169 +14876,235 @@
             </m:r>
           </m:sup>
         </m:sSup>
-      </m:oMath>
-      <w:r>
-        <w:t xml:space="preserve"> </w:t>
-      </w:r>
-      <w:r>
-        <w:t xml:space="preserve">is positive on one side of</w:t>
-      </w:r>
-      <w:r>
-        <w:t xml:space="preserve"> </w:t>
-      </w:r>
-      <m:oMath>
+        <m:r>
+          <m:rPr>
+            <m:sty m:val="p"/>
+          </m:rPr>
+          <m:t>(</m:t>
+        </m:r>
         <m:r>
           <m:t>c</m:t>
         </m:r>
-      </m:oMath>
-      <w:r>
-        <w:t xml:space="preserve"> </w:t>
-      </w:r>
-      <w:r>
-        <w:t xml:space="preserve">and negative on the other.</w:t>
+        <m:r>
+          <m:rPr>
+            <m:sty m:val="p"/>
+          </m:rPr>
+          <m:t>)</m:t>
+        </m:r>
+        <m:r>
+          <m:rPr>
+            <m:sty m:val="p"/>
+          </m:rPr>
+          <m:t>=</m:t>
+        </m:r>
+        <m:r>
+          <m:t>0</m:t>
+        </m:r>
+      </m:oMath>
+      <w:r>
+        <w:t xml:space="preserve"> </w:t>
+      </w:r>
+      <w:r>
+        <w:t xml:space="preserve">at a</w:t>
+      </w:r>
+      <w:r>
+        <w:t xml:space="preserve"> </w:t>
+      </w:r>
+      <w:hyperlink w:anchor="def-flat-point">
+        <w:r>
+          <w:rPr>
+            <w:rStyle w:val="Hyperlink"/>
+          </w:rPr>
+          <w:t xml:space="preserve">flat point</w:t>
+        </w:r>
+      </w:hyperlink>
+      <w:r>
+        <w:t xml:space="preserve"> </w:t>
+      </w:r>
+      <m:oMath>
+        <m:r>
+          <m:t>c</m:t>
+        </m:r>
+      </m:oMath>
+      <w:r>
+        <w:t xml:space="preserve">,</w:t>
+      </w:r>
+      <w:r>
+        <w:t xml:space="preserve"> </w:t>
+      </w:r>
+      <w:r>
+        <w:t xml:space="preserve">the</w:t>
+      </w:r>
+      <w:r>
+        <w:t xml:space="preserve"> </w:t>
+      </w:r>
+      <w:hyperlink w:anchor="thm-second-derivative-test">
+        <w:r>
+          <w:rPr>
+            <w:rStyle w:val="Hyperlink"/>
+          </w:rPr>
+          <w:t xml:space="preserve">second derivative test</w:t>
+        </w:r>
+      </w:hyperlink>
+      <w:r>
+        <w:t xml:space="preserve"> </w:t>
+      </w:r>
+      <w:r>
+        <w:t xml:space="preserve">does not decide:</w:t>
+      </w:r>
+      <w:r>
+        <w:t xml:space="preserve"> </w:t>
+      </w:r>
+      <m:oMath>
+        <m:r>
+          <m:t>f</m:t>
+        </m:r>
+      </m:oMath>
+      <w:r>
+        <w:t xml:space="preserve"> </w:t>
+      </w:r>
+      <w:r>
+        <w:t xml:space="preserve">may be smallest at</w:t>
+      </w:r>
+      <w:r>
+        <w:t xml:space="preserve"> </w:t>
+      </w:r>
+      <m:oMath>
+        <m:r>
+          <m:t>c</m:t>
+        </m:r>
+      </m:oMath>
+      <w:r>
+        <w:t xml:space="preserve"> </w:t>
+      </w:r>
+      <w:r>
+        <w:t xml:space="preserve">among nearby points, largest there, or neither</w:t>
+      </w:r>
+      <w:r>
+        <w:t xml:space="preserve"> </w:t>
+      </w:r>
+      <w:r>
+        <w:t xml:space="preserve">(</w:t>
+      </w:r>
+      <w:hyperlink w:anchor="exm-second-derivative-test">
+        <w:r>
+          <w:rPr>
+            <w:rStyle w:val="Hyperlink"/>
+          </w:rPr>
+          <w:t xml:space="preserve">Example 4</w:t>
+        </w:r>
+      </w:hyperlink>
+      <w:r>
+        <w:t xml:space="preserve">).</w:t>
       </w:r>
     </w:p>
     <w:bookmarkEnd w:id="74"/>
-    <w:bookmarkStart w:id="76" w:name="rem-inflection-point"/>
+    <w:bookmarkStart w:id="75" w:name="def-inflection-point"/>
     <w:p>
       <w:pPr>
         <w:pStyle w:val="BodyText"/>
       </w:pPr>
       <w:r>
         <w:rPr>
-          <w:i/>
-          <w:iCs/>
-        </w:rPr>
-        <w:t xml:space="preserve">Remark 1</w:t>
-      </w:r>
-      <w:r>
-        <w:t xml:space="preserve"> (Inflection points change the curvature). </w:t>
-      </w:r>
-      <w:r>
-        <w:t xml:space="preserve">At an</w:t>
-      </w:r>
-      <w:r>
-        <w:t xml:space="preserve"> </w:t>
-      </w:r>
-      <w:hyperlink w:anchor="def-inflection-point">
+          <w:b/>
+          <w:bCs/>
+        </w:rPr>
+        <w:t xml:space="preserve">Definition 3 (Inflection point)</w:t>
+      </w:r>
+      <w:r>
+        <w:t xml:space="preserve"> </w:t>
+      </w:r>
+      <w:r>
+        <w:t xml:space="preserve">An</w:t>
+      </w:r>
+      <w:r>
+        <w:t xml:space="preserve"> </w:t>
+      </w:r>
+      <w:r>
+        <w:rPr>
+          <w:b/>
+          <w:bCs/>
+        </w:rPr>
+        <w:t xml:space="preserve">inflection point</w:t>
+      </w:r>
+      <w:r>
+        <w:t xml:space="preserve"> </w:t>
+      </w:r>
+      <w:r>
+        <w:t xml:space="preserve">of a</w:t>
+      </w:r>
+      <w:r>
+        <w:t xml:space="preserve"> </w:t>
+      </w:r>
+      <w:hyperlink r:id="rId22">
         <w:r>
           <w:rPr>
             <w:rStyle w:val="Hyperlink"/>
           </w:rPr>
-          <w:t xml:space="preserve">inflection point</w:t>
+          <w:t xml:space="preserve">function</w:t>
         </w:r>
       </w:hyperlink>
       <w:r>
-        <w:t xml:space="preserve">, the</w:t>
-      </w:r>
-      <w:r>
-        <w:t xml:space="preserve"> </w:t>
-      </w:r>
-      <w:hyperlink r:id="rId75">
+        <w:t xml:space="preserve"> </w:t>
+      </w:r>
+      <m:oMath>
+        <m:r>
+          <m:t>f</m:t>
+        </m:r>
+      </m:oMath>
+      <w:r>
+        <w:t xml:space="preserve"> </w:t>
+      </w:r>
+      <w:r>
+        <w:t xml:space="preserve">is a point</w:t>
+      </w:r>
+      <w:r>
+        <w:t xml:space="preserve"> </w:t>
+      </w:r>
+      <m:oMath>
+        <m:r>
+          <m:t>c</m:t>
+        </m:r>
+      </m:oMath>
+      <w:r>
+        <w:t xml:space="preserve"> </w:t>
+      </w:r>
+      <w:r>
+        <w:t xml:space="preserve">such that, on some</w:t>
+      </w:r>
+      <w:r>
+        <w:t xml:space="preserve"> </w:t>
+      </w:r>
+      <w:hyperlink r:id="rId14">
         <w:r>
           <w:rPr>
             <w:rStyle w:val="Hyperlink"/>
           </w:rPr>
-          <w:t xml:space="preserve">graph</w:t>
+          <w:t xml:space="preserve">open interval</w:t>
         </w:r>
       </w:hyperlink>
       <w:r>
         <w:t xml:space="preserve"> </w:t>
       </w:r>
       <w:r>
-        <w:t xml:space="preserve">changes between curving up and curving down.</w:t>
-      </w:r>
-    </w:p>
-    <w:bookmarkEnd w:id="76"/>
-    <w:bookmarkStart w:id="77" w:name="exm-inflection-point"/>
-    <w:p>
-      <w:pPr>
-        <w:pStyle w:val="BodyText"/>
-      </w:pPr>
-      <w:r>
-        <w:rPr>
-          <w:b/>
-          <w:bCs/>
-        </w:rPr>
-        <w:t xml:space="preserve">Example 5 (An inflection point of</w:t>
-      </w:r>
-      <w:r>
-        <w:rPr>
-          <w:b/>
-          <w:bCs/>
-        </w:rPr>
-        <w:t xml:space="preserve"> </w:t>
-      </w:r>
-      <m:oMath>
-        <m:sSup>
-          <m:e>
-            <m:r>
-              <m:t>x</m:t>
-            </m:r>
-          </m:e>
-          <m:sup>
-            <m:r>
-              <m:t>3</m:t>
-            </m:r>
-          </m:sup>
-        </m:sSup>
-      </m:oMath>
-      <w:r>
-        <w:rPr>
-          <w:b/>
-          <w:bCs/>
-        </w:rPr>
-        <w:t xml:space="preserve">)</w:t>
-      </w:r>
-      <w:r>
-        <w:t xml:space="preserve"> </w:t>
-      </w:r>
-      <w:r>
-        <w:t xml:space="preserve">For</w:t>
-      </w:r>
-      <w:r>
-        <w:t xml:space="preserve"> </w:t>
-      </w:r>
-      <m:oMath>
-        <m:r>
-          <m:t>f</m:t>
-        </m:r>
-        <m:r>
-          <m:rPr>
-            <m:sty m:val="p"/>
-          </m:rPr>
-          <m:t>(</m:t>
-        </m:r>
-        <m:r>
-          <m:t>x</m:t>
-        </m:r>
-        <m:r>
-          <m:rPr>
-            <m:sty m:val="p"/>
-          </m:rPr>
-          <m:t>)</m:t>
-        </m:r>
-        <m:r>
-          <m:rPr>
-            <m:sty m:val="p"/>
-          </m:rPr>
-          <m:t>=</m:t>
-        </m:r>
-        <m:sSup>
-          <m:e>
-            <m:r>
-              <m:t>x</m:t>
-            </m:r>
-          </m:e>
-          <m:sup>
-            <m:r>
-              <m:t>3</m:t>
-            </m:r>
-          </m:sup>
-        </m:sSup>
-      </m:oMath>
-      <w:r>
-        <w:t xml:space="preserve">, the</w:t>
+        <w:t xml:space="preserve">around</w:t>
+      </w:r>
+      <w:r>
+        <w:t xml:space="preserve"> </w:t>
+      </w:r>
+      <m:oMath>
+        <m:r>
+          <m:t>c</m:t>
+        </m:r>
+      </m:oMath>
+      <w:r>
+        <w:t xml:space="preserve">,</w:t>
+      </w:r>
+      <w:r>
+        <w:t xml:space="preserve"> </w:t>
+      </w:r>
+      <w:r>
+        <w:t xml:space="preserve">the</w:t>
       </w:r>
       <w:r>
         <w:t xml:space="preserve"> </w:t>
@@ -15151,12 +15117,6 @@
           <w:t xml:space="preserve">second derivative</w:t>
         </w:r>
       </w:hyperlink>
-      <w:r>
-        <w:t xml:space="preserve"> </w:t>
-      </w:r>
-      <w:r>
-        <w:t xml:space="preserve">is</w:t>
-      </w:r>
       <w:r>
         <w:t xml:space="preserve"> </w:t>
       </w:r>
@@ -15176,105 +15136,46 @@
             </m:r>
           </m:sup>
         </m:sSup>
-        <m:r>
-          <m:rPr>
-            <m:sty m:val="p"/>
-          </m:rPr>
-          <m:t>(</m:t>
-        </m:r>
-        <m:r>
-          <m:t>x</m:t>
-        </m:r>
-        <m:r>
-          <m:rPr>
-            <m:sty m:val="p"/>
-          </m:rPr>
-          <m:t>)</m:t>
-        </m:r>
-        <m:r>
-          <m:rPr>
-            <m:sty m:val="p"/>
-          </m:rPr>
-          <m:t>=</m:t>
-        </m:r>
-        <m:r>
-          <m:t>6</m:t>
-        </m:r>
-        <m:r>
-          <m:t>x</m:t>
-        </m:r>
-      </m:oMath>
-      <w:r>
-        <w:t xml:space="preserve">,</w:t>
-      </w:r>
-      <w:r>
-        <w:t xml:space="preserve"> </w:t>
-      </w:r>
-      <w:r>
-        <w:t xml:space="preserve">which is negative for</w:t>
-      </w:r>
-      <w:r>
-        <w:t xml:space="preserve"> </w:t>
-      </w:r>
-      <m:oMath>
-        <m:r>
-          <m:t>x</m:t>
-        </m:r>
-        <m:r>
-          <m:rPr>
-            <m:sty m:val="p"/>
-          </m:rPr>
-          <m:t>&lt;</m:t>
-        </m:r>
-        <m:r>
-          <m:t>0</m:t>
-        </m:r>
-      </m:oMath>
-      <w:r>
-        <w:t xml:space="preserve"> </w:t>
-      </w:r>
-      <w:r>
-        <w:t xml:space="preserve">and positive for</w:t>
-      </w:r>
-      <w:r>
-        <w:t xml:space="preserve"> </w:t>
-      </w:r>
-      <m:oMath>
-        <m:r>
-          <m:t>x</m:t>
-        </m:r>
-        <m:r>
-          <m:rPr>
-            <m:sty m:val="p"/>
-          </m:rPr>
-          <m:t>&gt;</m:t>
-        </m:r>
-        <m:r>
-          <m:t>0</m:t>
-        </m:r>
-      </m:oMath>
-      <w:r>
-        <w:t xml:space="preserve">.</w:t>
-      </w:r>
-      <w:r>
-        <w:t xml:space="preserve"> </w:t>
-      </w:r>
-      <w:r>
-        <w:t xml:space="preserve">So</w:t>
-      </w:r>
-      <w:r>
-        <w:t xml:space="preserve"> </w:t>
-      </w:r>
-      <m:oMath>
-        <m:r>
-          <m:t>0</m:t>
-        </m:r>
-      </m:oMath>
-      <w:r>
-        <w:t xml:space="preserve"> </w:t>
-      </w:r>
-      <w:r>
-        <w:t xml:space="preserve">is an</w:t>
+      </m:oMath>
+      <w:r>
+        <w:t xml:space="preserve"> </w:t>
+      </w:r>
+      <w:r>
+        <w:t xml:space="preserve">is positive on one side of</w:t>
+      </w:r>
+      <w:r>
+        <w:t xml:space="preserve"> </w:t>
+      </w:r>
+      <m:oMath>
+        <m:r>
+          <m:t>c</m:t>
+        </m:r>
+      </m:oMath>
+      <w:r>
+        <w:t xml:space="preserve"> </w:t>
+      </w:r>
+      <w:r>
+        <w:t xml:space="preserve">and negative on the other.</w:t>
+      </w:r>
+    </w:p>
+    <w:bookmarkEnd w:id="75"/>
+    <w:bookmarkStart w:id="77" w:name="rem-inflection-point"/>
+    <w:p>
+      <w:pPr>
+        <w:pStyle w:val="BodyText"/>
+      </w:pPr>
+      <w:r>
+        <w:rPr>
+          <w:i/>
+          <w:iCs/>
+        </w:rPr>
+        <w:t xml:space="preserve">Remark 2</w:t>
+      </w:r>
+      <w:r>
+        <w:t xml:space="preserve"> (Inflection points change the curvature). </w:t>
+      </w:r>
+      <w:r>
+        <w:t xml:space="preserve">At an</w:t>
       </w:r>
       <w:r>
         <w:t xml:space="preserve"> </w:t>
@@ -15288,25 +15189,284 @@
         </w:r>
       </w:hyperlink>
       <w:r>
-        <w:t xml:space="preserve"> </w:t>
-      </w:r>
-      <w:r>
-        <w:t xml:space="preserve">of</w:t>
-      </w:r>
-      <w:r>
-        <w:t xml:space="preserve"> </w:t>
-      </w:r>
-      <m:oMath>
-        <m:r>
-          <m:t>f</m:t>
-        </m:r>
-      </m:oMath>
-      <w:r>
-        <w:t xml:space="preserve">.</w:t>
+        <w:t xml:space="preserve">, the</w:t>
+      </w:r>
+      <w:r>
+        <w:t xml:space="preserve"> </w:t>
+      </w:r>
+      <w:hyperlink r:id="rId76">
+        <w:r>
+          <w:rPr>
+            <w:rStyle w:val="Hyperlink"/>
+          </w:rPr>
+          <w:t xml:space="preserve">graph</w:t>
+        </w:r>
+      </w:hyperlink>
+      <w:r>
+        <w:t xml:space="preserve"> </w:t>
+      </w:r>
+      <w:r>
+        <w:t xml:space="preserve">changes between curving up and curving down.</w:t>
       </w:r>
     </w:p>
     <w:bookmarkEnd w:id="77"/>
-    <w:bookmarkStart w:id="83" w:name="exr-miller-deriv-opt-gamma-kernel"/>
+    <w:bookmarkStart w:id="78" w:name="exm-inflection-point"/>
+    <w:p>
+      <w:pPr>
+        <w:pStyle w:val="BodyText"/>
+      </w:pPr>
+      <w:r>
+        <w:rPr>
+          <w:b/>
+          <w:bCs/>
+        </w:rPr>
+        <w:t xml:space="preserve">Example 5 (An inflection point of</w:t>
+      </w:r>
+      <w:r>
+        <w:rPr>
+          <w:b/>
+          <w:bCs/>
+        </w:rPr>
+        <w:t xml:space="preserve"> </w:t>
+      </w:r>
+      <m:oMath>
+        <m:sSup>
+          <m:e>
+            <m:r>
+              <m:t>x</m:t>
+            </m:r>
+          </m:e>
+          <m:sup>
+            <m:r>
+              <m:t>3</m:t>
+            </m:r>
+          </m:sup>
+        </m:sSup>
+      </m:oMath>
+      <w:r>
+        <w:rPr>
+          <w:b/>
+          <w:bCs/>
+        </w:rPr>
+        <w:t xml:space="preserve">)</w:t>
+      </w:r>
+      <w:r>
+        <w:t xml:space="preserve"> </w:t>
+      </w:r>
+      <w:r>
+        <w:t xml:space="preserve">For</w:t>
+      </w:r>
+      <w:r>
+        <w:t xml:space="preserve"> </w:t>
+      </w:r>
+      <m:oMath>
+        <m:r>
+          <m:t>f</m:t>
+        </m:r>
+        <m:r>
+          <m:rPr>
+            <m:sty m:val="p"/>
+          </m:rPr>
+          <m:t>(</m:t>
+        </m:r>
+        <m:r>
+          <m:t>x</m:t>
+        </m:r>
+        <m:r>
+          <m:rPr>
+            <m:sty m:val="p"/>
+          </m:rPr>
+          <m:t>)</m:t>
+        </m:r>
+        <m:r>
+          <m:rPr>
+            <m:sty m:val="p"/>
+          </m:rPr>
+          <m:t>=</m:t>
+        </m:r>
+        <m:sSup>
+          <m:e>
+            <m:r>
+              <m:t>x</m:t>
+            </m:r>
+          </m:e>
+          <m:sup>
+            <m:r>
+              <m:t>3</m:t>
+            </m:r>
+          </m:sup>
+        </m:sSup>
+      </m:oMath>
+      <w:r>
+        <w:t xml:space="preserve">, the</w:t>
+      </w:r>
+      <w:r>
+        <w:t xml:space="preserve"> </w:t>
+      </w:r>
+      <w:hyperlink r:id="rId69">
+        <w:r>
+          <w:rPr>
+            <w:rStyle w:val="Hyperlink"/>
+          </w:rPr>
+          <w:t xml:space="preserve">second derivative</w:t>
+        </w:r>
+      </w:hyperlink>
+      <w:r>
+        <w:t xml:space="preserve"> </w:t>
+      </w:r>
+      <w:r>
+        <w:t xml:space="preserve">is</w:t>
+      </w:r>
+      <w:r>
+        <w:t xml:space="preserve"> </w:t>
+      </w:r>
+      <m:oMath>
+        <m:sSup>
+          <m:e>
+            <m:r>
+              <m:t>f</m:t>
+            </m:r>
+          </m:e>
+          <m:sup>
+            <m:r>
+              <m:rPr>
+                <m:sty m:val="p"/>
+              </m:rPr>
+              <m:t>″</m:t>
+            </m:r>
+          </m:sup>
+        </m:sSup>
+        <m:r>
+          <m:rPr>
+            <m:sty m:val="p"/>
+          </m:rPr>
+          <m:t>(</m:t>
+        </m:r>
+        <m:r>
+          <m:t>x</m:t>
+        </m:r>
+        <m:r>
+          <m:rPr>
+            <m:sty m:val="p"/>
+          </m:rPr>
+          <m:t>)</m:t>
+        </m:r>
+        <m:r>
+          <m:rPr>
+            <m:sty m:val="p"/>
+          </m:rPr>
+          <m:t>=</m:t>
+        </m:r>
+        <m:r>
+          <m:t>6</m:t>
+        </m:r>
+        <m:r>
+          <m:t>x</m:t>
+        </m:r>
+      </m:oMath>
+      <w:r>
+        <w:t xml:space="preserve">,</w:t>
+      </w:r>
+      <w:r>
+        <w:t xml:space="preserve"> </w:t>
+      </w:r>
+      <w:r>
+        <w:t xml:space="preserve">which is negative for</w:t>
+      </w:r>
+      <w:r>
+        <w:t xml:space="preserve"> </w:t>
+      </w:r>
+      <m:oMath>
+        <m:r>
+          <m:t>x</m:t>
+        </m:r>
+        <m:r>
+          <m:rPr>
+            <m:sty m:val="p"/>
+          </m:rPr>
+          <m:t>&lt;</m:t>
+        </m:r>
+        <m:r>
+          <m:t>0</m:t>
+        </m:r>
+      </m:oMath>
+      <w:r>
+        <w:t xml:space="preserve"> </w:t>
+      </w:r>
+      <w:r>
+        <w:t xml:space="preserve">and positive for</w:t>
+      </w:r>
+      <w:r>
+        <w:t xml:space="preserve"> </w:t>
+      </w:r>
+      <m:oMath>
+        <m:r>
+          <m:t>x</m:t>
+        </m:r>
+        <m:r>
+          <m:rPr>
+            <m:sty m:val="p"/>
+          </m:rPr>
+          <m:t>&gt;</m:t>
+        </m:r>
+        <m:r>
+          <m:t>0</m:t>
+        </m:r>
+      </m:oMath>
+      <w:r>
+        <w:t xml:space="preserve">.</w:t>
+      </w:r>
+      <w:r>
+        <w:t xml:space="preserve"> </w:t>
+      </w:r>
+      <w:r>
+        <w:t xml:space="preserve">So</w:t>
+      </w:r>
+      <w:r>
+        <w:t xml:space="preserve"> </w:t>
+      </w:r>
+      <m:oMath>
+        <m:r>
+          <m:t>0</m:t>
+        </m:r>
+      </m:oMath>
+      <w:r>
+        <w:t xml:space="preserve"> </w:t>
+      </w:r>
+      <w:r>
+        <w:t xml:space="preserve">is an</w:t>
+      </w:r>
+      <w:r>
+        <w:t xml:space="preserve"> </w:t>
+      </w:r>
+      <w:hyperlink w:anchor="def-inflection-point">
+        <w:r>
+          <w:rPr>
+            <w:rStyle w:val="Hyperlink"/>
+          </w:rPr>
+          <w:t xml:space="preserve">inflection point</w:t>
+        </w:r>
+      </w:hyperlink>
+      <w:r>
+        <w:t xml:space="preserve"> </w:t>
+      </w:r>
+      <w:r>
+        <w:t xml:space="preserve">of</w:t>
+      </w:r>
+      <w:r>
+        <w:t xml:space="preserve"> </w:t>
+      </w:r>
+      <m:oMath>
+        <m:r>
+          <m:t>f</m:t>
+        </m:r>
+      </m:oMath>
+      <w:r>
+        <w:t xml:space="preserve">.</w:t>
+      </w:r>
+    </w:p>
+    <w:bookmarkEnd w:id="78"/>
+    <w:bookmarkStart w:id="84" w:name="exr-miller-deriv-opt-gamma-kernel"/>
     <w:p>
       <w:pPr>
         <w:pStyle w:val="BodyText"/>
@@ -15344,7 +15504,7 @@
       <w:r>
         <w:t xml:space="preserve"> </w:t>
       </w:r>
-      <w:hyperlink r:id="rId78">
+      <w:hyperlink r:id="rId79">
         <w:r>
           <w:rPr>
             <w:rStyle w:val="Hyperlink"/>
@@ -15384,7 +15544,7 @@
       <w:r>
         <w:t xml:space="preserve"> </w:t>
       </w:r>
-      <w:hyperlink r:id="rId79">
+      <w:hyperlink r:id="rId80">
         <w:r>
           <w:rPr>
             <w:rStyle w:val="Hyperlink"/>
@@ -15486,7 +15646,7 @@
       <w:r>
         <w:t xml:space="preserve"> </w:t>
       </w:r>
-      <w:hyperlink r:id="rId80">
+      <w:hyperlink r:id="rId81">
         <w:r>
           <w:rPr>
             <w:rStyle w:val="Hyperlink"/>
@@ -15506,7 +15666,7 @@
       <w:r>
         <w:t xml:space="preserve">(</w:t>
       </w:r>
-      <w:hyperlink r:id="rId81">
+      <w:hyperlink r:id="rId82">
         <w:r>
           <w:rPr>
             <w:rStyle w:val="Hyperlink"/>
@@ -15526,7 +15686,7 @@
       <w:r>
         <w:t xml:space="preserve"> </w:t>
       </w:r>
-      <w:hyperlink r:id="rId82">
+      <w:hyperlink r:id="rId83">
         <w:r>
           <w:rPr>
             <w:rStyle w:val="Hyperlink"/>
@@ -15712,8 +15872,8 @@
         <w:t xml:space="preserve">.</w:t>
       </w:r>
     </w:p>
-    <w:bookmarkEnd w:id="83"/>
-    <w:bookmarkStart w:id="84" w:name="sol-miller-deriv-opt-gamma-kernel"/>
+    <w:bookmarkEnd w:id="84"/>
+    <w:bookmarkStart w:id="85" w:name="sol-miller-deriv-opt-gamma-kernel"/>
     <w:p>
       <w:pPr>
         <w:pStyle w:val="BodyText"/>
@@ -16597,8 +16757,8 @@
         <w:t xml:space="preserve">.</w:t>
       </w:r>
     </w:p>
-    <w:bookmarkEnd w:id="84"/>
-    <w:bookmarkStart w:id="87" w:name="X2af8583915c3d6755df2ace9fe2e1b48908f679"/>
+    <w:bookmarkEnd w:id="85"/>
+    <w:bookmarkStart w:id="88" w:name="X2af8583915c3d6755df2ace9fe2e1b48908f679"/>
     <w:p>
       <w:pPr>
         <w:pStyle w:val="BodyText"/>
@@ -16636,7 +16796,7 @@
       <w:r>
         <w:t xml:space="preserve"> </w:t>
       </w:r>
-      <w:hyperlink r:id="rId85">
+      <w:hyperlink r:id="rId86">
         <w:r>
           <w:rPr>
             <w:rStyle w:val="Hyperlink"/>
@@ -16653,7 +16813,7 @@
       <w:r>
         <w:t xml:space="preserve"> </w:t>
       </w:r>
-      <w:hyperlink r:id="rId86">
+      <w:hyperlink r:id="rId87">
         <w:r>
           <w:rPr>
             <w:rStyle w:val="Hyperlink"/>
@@ -16881,8 +17041,8 @@
         <w:t xml:space="preserve">.</w:t>
       </w:r>
     </w:p>
-    <w:bookmarkEnd w:id="87"/>
-    <w:bookmarkStart w:id="88" w:name="X9a58de6c6ab4baf2df3e3111c406b3abe7c25e0"/>
+    <w:bookmarkEnd w:id="88"/>
+    <w:bookmarkStart w:id="89" w:name="X9a58de6c6ab4baf2df3e3111c406b3abe7c25e0"/>
     <w:p>
       <w:pPr>
         <w:pStyle w:val="BodyText"/>
@@ -17659,9 +17819,9 @@
         <w:t xml:space="preserve">is non-zero at both critical points, neither is an inflection point.</w:t>
       </w:r>
     </w:p>
-    <w:bookmarkEnd w:id="88"/>
     <w:bookmarkEnd w:id="89"/>
-    <w:bookmarkStart w:id="169" w:name="sec-optimality-vector"/>
+    <w:bookmarkEnd w:id="90"/>
+    <w:bookmarkStart w:id="170" w:name="sec-optimality-vector"/>
     <w:p>
       <w:pPr>
         <w:pStyle w:val="Heading2"/>
@@ -17711,18 +17871,18 @@
                 <wp:inline>
                   <wp:extent cx="152400" cy="152400"/>
                   <wp:effectExtent b="0" l="0" r="0" t="0"/>
-                  <wp:docPr descr="" title="" id="91" name="Picture"/>
+                  <wp:docPr descr="" title="" id="92" name="Picture"/>
                   <a:graphic>
                     <a:graphicData uri="http://schemas.openxmlformats.org/drawingml/2006/picture">
                       <pic:pic>
                         <pic:nvPicPr>
-                          <pic:cNvPr descr="/opt/quarto/share/formats/docx/note.png" id="92" name="Picture"/>
+                          <pic:cNvPr descr="/opt/quarto/share/formats/docx/note.png" id="93" name="Picture"/>
                           <pic:cNvPicPr>
                             <a:picLocks noChangeArrowheads="1" noChangeAspect="1"/>
                           </pic:cNvPicPr>
                         </pic:nvPicPr>
                         <pic:blipFill>
-                          <a:blip r:embed="rId90"/>
+                          <a:blip r:embed="rId91"/>
                           <a:stretch>
                             <a:fillRect/>
                           </a:stretch>
@@ -17805,7 +17965,7 @@
             <w:r>
               <w:t xml:space="preserve"> </w:t>
             </w:r>
-            <w:hyperlink r:id="rId93">
+            <w:hyperlink r:id="rId94">
               <w:r>
                 <w:rPr>
                   <w:rStyle w:val="Hyperlink"/>
@@ -17825,7 +17985,7 @@
             <w:r>
               <w:t xml:space="preserve"> </w:t>
             </w:r>
-            <w:hyperlink r:id="rId94">
+            <w:hyperlink r:id="rId95">
               <w:r>
                 <w:rPr>
                   <w:rStyle w:val="Hyperlink"/>
@@ -18171,7 +18331,7 @@
       <w:r>
         <w:t xml:space="preserve">(</w:t>
       </w:r>
-      <w:hyperlink r:id="rId95">
+      <w:hyperlink r:id="rId96">
         <w:r>
           <w:rPr>
             <w:rStyle w:val="Hyperlink"/>
@@ -18265,7 +18425,7 @@
         <w:t xml:space="preserve">.</w:t>
       </w:r>
     </w:p>
-    <w:bookmarkStart w:id="97" w:name="thm-fermat"/>
+    <w:bookmarkStart w:id="98" w:name="thm-fermat"/>
     <w:p>
       <w:pPr>
         <w:pStyle w:val="BodyText"/>
@@ -18300,7 +18460,7 @@
       <w:r>
         <w:t xml:space="preserve"> </w:t>
       </w:r>
-      <w:hyperlink r:id="rId96">
+      <w:hyperlink r:id="rId97">
         <w:r>
           <w:rPr>
             <w:rStyle w:val="Hyperlink"/>
@@ -18495,7 +18655,7 @@
         <w:t xml:space="preserve">[4]</w:t>
       </w:r>
     </w:p>
-    <w:bookmarkEnd w:id="97"/>
+    <w:bookmarkEnd w:id="98"/>
     <w:p>
       <w:pPr>
         <w:pStyle w:val="BodyText"/>
@@ -19207,7 +19367,7 @@
         <w:t xml:space="preserve">.</w:t>
       </w:r>
     </w:p>
-    <w:bookmarkStart w:id="99" w:name="exm-fermat"/>
+    <w:bookmarkStart w:id="100" w:name="exm-fermat"/>
     <w:p>
       <w:pPr>
         <w:pStyle w:val="BodyText"/>
@@ -19434,7 +19594,7 @@
       <w:r>
         <w:t xml:space="preserve"> </w:t>
       </w:r>
-      <w:hyperlink r:id="rId98">
+      <w:hyperlink r:id="rId99">
         <w:r>
           <w:rPr>
             <w:rStyle w:val="Hyperlink"/>
@@ -20003,8 +20163,8 @@
         <w:t xml:space="preserve">does not exist.</w:t>
       </w:r>
     </w:p>
-    <w:bookmarkEnd w:id="99"/>
-    <w:bookmarkStart w:id="100" w:name="def-stationary-point"/>
+    <w:bookmarkEnd w:id="100"/>
+    <w:bookmarkStart w:id="101" w:name="def-stationary-point"/>
     <w:p>
       <w:pPr>
         <w:pStyle w:val="FirstParagraph"/>
@@ -20132,8 +20292,8 @@
         <w:t xml:space="preserve">.</w:t>
       </w:r>
     </w:p>
-    <w:bookmarkEnd w:id="100"/>
-    <w:bookmarkStart w:id="101" w:name="exm-stationary-point"/>
+    <w:bookmarkEnd w:id="101"/>
+    <w:bookmarkStart w:id="102" w:name="exm-stationary-point"/>
     <w:p>
       <w:pPr>
         <w:pStyle w:val="BodyText"/>
@@ -20447,7 +20607,7 @@
         <w:t xml:space="preserve">.</w:t>
       </w:r>
     </w:p>
-    <w:bookmarkEnd w:id="101"/>
+    <w:bookmarkEnd w:id="102"/>
     <w:tbl>
       <w:tblPr>
         <w:tblStyle w:val="Table"/>
@@ -20461,7 +20621,7 @@
       <w:tr>
         <w:tc>
           <w:tcPr/>
-          <w:bookmarkStart w:id="109" w:name="fig-stationary-point"/>
+          <w:bookmarkStart w:id="110" w:name="fig-stationary-point"/>
           <w:p>
             <w:pPr>
               <w:pStyle w:val="Heading3"/>
@@ -21734,18 +21894,18 @@
                 <wp:inline>
                   <wp:extent cx="4620126" cy="3696101"/>
                   <wp:effectExtent b="0" l="0" r="0" t="0"/>
-                  <wp:docPr descr="" title="" id="103" name="Picture"/>
+                  <wp:docPr descr="" title="" id="104" name="Picture"/>
                   <a:graphic>
                     <a:graphicData uri="http://schemas.openxmlformats.org/drawingml/2006/picture">
                       <pic:pic>
                         <pic:nvPicPr>
-                          <pic:cNvPr descr="optimization-critical-points_files/figure-docx/stationary-point-r-3.png" id="104" name="Picture"/>
+                          <pic:cNvPr descr="optimization-critical-points_files/figure-docx/stationary-point-r-3.png" id="105" name="Picture"/>
                           <pic:cNvPicPr>
                             <a:picLocks noChangeArrowheads="1" noChangeAspect="1"/>
                           </pic:cNvPicPr>
                         </pic:nvPicPr>
                         <pic:blipFill>
-                          <a:blip r:embed="rId102"/>
+                          <a:blip r:embed="rId103"/>
                           <a:stretch>
                             <a:fillRect/>
                           </a:stretch>
@@ -22501,18 +22661,18 @@
                 <wp:inline>
                   <wp:extent cx="4572000" cy="3657600"/>
                   <wp:effectExtent b="0" l="0" r="0" t="0"/>
-                  <wp:docPr descr="" title="" id="106" name="Picture"/>
+                  <wp:docPr descr="" title="" id="107" name="Picture"/>
                   <a:graphic>
                     <a:graphicData uri="http://schemas.openxmlformats.org/drawingml/2006/picture">
                       <pic:pic>
                         <pic:nvPicPr>
-                          <pic:cNvPr descr="optimization-critical-points_files/figure-docx/stationary-point-python-1.png" id="107" name="Picture"/>
+                          <pic:cNvPr descr="optimization-critical-points_files/figure-docx/stationary-point-python-1.png" id="108" name="Picture"/>
                           <pic:cNvPicPr>
                             <a:picLocks noChangeArrowheads="1" noChangeAspect="1"/>
                           </pic:cNvPicPr>
                         </pic:nvPicPr>
                         <pic:blipFill>
-                          <a:blip r:embed="rId105"/>
+                          <a:blip r:embed="rId106"/>
                           <a:stretch>
                             <a:fillRect/>
                           </a:stretch>
@@ -22554,7 +22714,7 @@
             <w:r>
               <w:t xml:space="preserve"> </w:t>
             </w:r>
-            <w:hyperlink r:id="rId108">
+            <w:hyperlink r:id="rId109">
               <w:r>
                 <w:rPr>
                   <w:rStyle w:val="Hyperlink"/>
@@ -22608,7 +22768,7 @@
             <w:r>
               <w:t xml:space="preserve"> </w:t>
             </w:r>
-            <w:hyperlink r:id="rId95">
+            <w:hyperlink r:id="rId96">
               <w:r>
                 <w:rPr>
                   <w:rStyle w:val="Hyperlink"/>
@@ -22758,11 +22918,11 @@
               <w:t xml:space="preserve">.</w:t>
             </w:r>
           </w:p>
-          <w:bookmarkEnd w:id="109"/>
+          <w:bookmarkEnd w:id="110"/>
         </w:tc>
       </w:tr>
     </w:tbl>
-    <w:bookmarkStart w:id="110" w:name="rem-stationary-point-one-variable"/>
+    <w:bookmarkStart w:id="111" w:name="rem-stationary-point-one-variable"/>
     <w:p>
       <w:pPr>
         <w:pStyle w:val="BodyText"/>
@@ -22772,7 +22932,7 @@
           <w:i/>
           <w:iCs/>
         </w:rPr>
-        <w:t xml:space="preserve">Remark 2</w:t>
+        <w:t xml:space="preserve">Remark 3</w:t>
       </w:r>
       <w:r>
         <w:t xml:space="preserve"> (Stationary points in one variable). </w:t>
@@ -22829,8 +22989,8 @@
         <w:t xml:space="preserve">).</w:t>
       </w:r>
     </w:p>
-    <w:bookmarkEnd w:id="110"/>
-    <w:bookmarkStart w:id="111" w:name="thm-first-order-condition"/>
+    <w:bookmarkEnd w:id="111"/>
+    <w:bookmarkStart w:id="112" w:name="thm-first-order-condition"/>
     <w:p>
       <w:pPr>
         <w:pStyle w:val="BodyText"/>
@@ -23010,7 +23170,7 @@
         <w:t xml:space="preserve">).</w:t>
       </w:r>
     </w:p>
-    <w:bookmarkEnd w:id="111"/>
+    <w:bookmarkEnd w:id="112"/>
     <w:p>
       <w:pPr>
         <w:pStyle w:val="BodyText"/>
@@ -23592,7 +23752,7 @@
       <w:r>
         <w:t xml:space="preserve">(</w:t>
       </w:r>
-      <w:hyperlink r:id="rId95">
+      <w:hyperlink r:id="rId96">
         <w:r>
           <w:rPr>
             <w:rStyle w:val="Hyperlink"/>
@@ -23604,7 +23764,7 @@
         <w:t xml:space="preserve">).</w:t>
       </w:r>
     </w:p>
-    <w:bookmarkStart w:id="113" w:name="exm-first-order-condition"/>
+    <w:bookmarkStart w:id="114" w:name="exm-first-order-condition"/>
     <w:p>
       <w:pPr>
         <w:pStyle w:val="BodyText"/>
@@ -23755,7 +23915,7 @@
       <w:r>
         <w:t xml:space="preserve"> </w:t>
       </w:r>
-      <w:hyperlink r:id="rId112">
+      <w:hyperlink r:id="rId113">
         <w:r>
           <w:rPr>
             <w:rStyle w:val="Hyperlink"/>
@@ -24039,8 +24199,8 @@
         <w:t xml:space="preserve">is not a local minimizer.</w:t>
       </w:r>
     </w:p>
-    <w:bookmarkEnd w:id="113"/>
-    <w:bookmarkStart w:id="117" w:name="exm-stationary-least-squares"/>
+    <w:bookmarkEnd w:id="114"/>
+    <w:bookmarkStart w:id="118" w:name="exm-stationary-least-squares"/>
     <w:p>
       <w:pPr>
         <w:pStyle w:val="FirstParagraph"/>
@@ -24104,7 +24264,7 @@
       <w:r>
         <w:t xml:space="preserve"> </w:t>
       </w:r>
-      <w:hyperlink r:id="rId114">
+      <w:hyperlink r:id="rId115">
         <w:r>
           <w:rPr>
             <w:rStyle w:val="VerbatimChar"/>
@@ -24136,7 +24296,7 @@
       <w:r>
         <w:t xml:space="preserve"> </w:t>
       </w:r>
-      <w:hyperlink r:id="rId115">
+      <w:hyperlink r:id="rId116">
         <w:r>
           <w:rPr>
             <w:rStyle w:val="VerbatimChar"/>
@@ -24168,7 +24328,7 @@
       <w:r>
         <w:t xml:space="preserve"> </w:t>
       </w:r>
-      <w:hyperlink r:id="rId116">
+      <w:hyperlink r:id="rId117">
         <w:r>
           <w:rPr>
             <w:rStyle w:val="VerbatimChar"/>
@@ -25913,7 +26073,7 @@
         <w:rPr>
           <w:rStyle w:val="CommentTok"/>
         </w:rPr>
-        <w:t xml:space="preserve">#&gt; [1] 9.471535e-12 6.662049e-11</w:t>
+        <w:t xml:space="preserve">#&gt; [1] 1.071498e-11 1.673470e-10</w:t>
       </w:r>
       <w:r>
         <w:br/>
@@ -26096,7 +26256,7 @@
         <w:t xml:space="preserve"> </w:t>
       </w:r>
       <w:r>
-        <w:t xml:space="preserve">6.7e-11,</w:t>
+        <w:t xml:space="preserve">1.7e-10,</w:t>
       </w:r>
       <w:r>
         <w:t xml:space="preserve"> </w:t>
@@ -26146,8 +26306,8 @@
         <w:t xml:space="preserve">The library fits above agree with the solution of that equation.</w:t>
       </w:r>
     </w:p>
-    <w:bookmarkEnd w:id="117"/>
-    <w:bookmarkStart w:id="119" w:name="thm-taylor-1d"/>
+    <w:bookmarkEnd w:id="118"/>
+    <w:bookmarkStart w:id="120" w:name="thm-taylor-1d"/>
     <w:p>
       <w:pPr>
         <w:pStyle w:val="BodyText"/>
@@ -26263,7 +26423,7 @@
       <w:r>
         <w:t xml:space="preserve"> </w:t>
       </w:r>
-      <w:hyperlink r:id="rId118">
+      <w:hyperlink r:id="rId119">
         <w:r>
           <w:rPr>
             <w:rStyle w:val="Hyperlink"/>
@@ -26651,7 +26811,7 @@
         </m:oMath>
       </m:oMathPara>
     </w:p>
-    <w:bookmarkEnd w:id="119"/>
+    <w:bookmarkEnd w:id="120"/>
     <w:p>
       <w:pPr>
         <w:pStyle w:val="FirstParagraph"/>
@@ -26698,7 +26858,7 @@
         <w:t xml:space="preserve">its proof uses the mean value theorem, which these notes do not develop.</w:t>
       </w:r>
     </w:p>
-    <w:bookmarkStart w:id="121" w:name="exm-taylor-1d"/>
+    <w:bookmarkStart w:id="122" w:name="exm-taylor-1d"/>
     <w:p>
       <w:pPr>
         <w:pStyle w:val="BodyText"/>
@@ -27185,7 +27345,7 @@
       <w:r>
         <w:t xml:space="preserve">(</w:t>
       </w:r>
-      <w:hyperlink r:id="rId120">
+      <w:hyperlink r:id="rId121">
         <w:r>
           <w:rPr>
             <w:rStyle w:val="Hyperlink"/>
@@ -27229,8 +27389,8 @@
         <w:t xml:space="preserve">.</w:t>
       </w:r>
     </w:p>
-    <w:bookmarkEnd w:id="121"/>
-    <w:bookmarkStart w:id="123" w:name="thm-taylor-mv"/>
+    <w:bookmarkEnd w:id="122"/>
+    <w:bookmarkStart w:id="124" w:name="thm-taylor-mv"/>
     <w:p>
       <w:pPr>
         <w:pStyle w:val="BodyText"/>
@@ -27330,7 +27490,7 @@
       <w:r>
         <w:t xml:space="preserve">(</w:t>
       </w:r>
-      <w:hyperlink r:id="rId122">
+      <w:hyperlink r:id="rId123">
         <w:r>
           <w:rPr>
             <w:rStyle w:val="Hyperlink"/>
@@ -27426,7 +27586,7 @@
     $$</w:t>
       </w:r>
     </w:p>
-    <w:bookmarkEnd w:id="123"/>
+    <w:bookmarkEnd w:id="124"/>
     <w:p>
       <w:pPr>
         <w:pStyle w:val="FirstParagraph"/>
@@ -27530,7 +27690,7 @@
       <w:r>
         <w:t xml:space="preserve"> </w:t>
       </w:r>
-      <w:hyperlink r:id="rId124">
+      <w:hyperlink r:id="rId125">
         <w:r>
           <w:rPr>
             <w:rStyle w:val="Hyperlink"/>
@@ -27677,7 +27837,7 @@
       <w:r>
         <w:t xml:space="preserve">, and its derivative (</w:t>
       </w:r>
-      <w:hyperlink r:id="rId125">
+      <w:hyperlink r:id="rId126">
         <w:r>
           <w:rPr>
             <w:rStyle w:val="Hyperlink"/>
@@ -27726,7 +27886,7 @@
       <w:r>
         <w:t xml:space="preserve">By the vector chain rule (</w:t>
       </w:r>
-      <w:hyperlink r:id="rId126">
+      <w:hyperlink r:id="rId127">
         <w:r>
           <w:rPr>
             <w:rStyle w:val="Hyperlink"/>
@@ -27816,7 +27976,7 @@
       <w:r>
         <w:t xml:space="preserve"> </w:t>
       </w:r>
-      <w:hyperlink r:id="rId127">
+      <w:hyperlink r:id="rId128">
         <w:r>
           <w:rPr>
             <w:rStyle w:val="Hyperlink"/>
@@ -27853,7 +28013,7 @@
       <w:r>
         <w:t xml:space="preserve">is continuous (</w:t>
       </w:r>
-      <w:hyperlink r:id="rId128">
+      <w:hyperlink r:id="rId129">
         <w:r>
           <w:rPr>
             <w:rStyle w:val="Hyperlink"/>
@@ -28060,7 +28220,7 @@
       <w:r>
         <w:t xml:space="preserve"> </w:t>
       </w:r>
-      <w:hyperlink r:id="rId127">
+      <w:hyperlink r:id="rId128">
         <w:r>
           <w:rPr>
             <w:rStyle w:val="Hyperlink"/>
@@ -28217,7 +28377,7 @@
     $$</w:t>
       </w:r>
     </w:p>
-    <w:bookmarkStart w:id="131" w:name="exm-taylor-mv"/>
+    <w:bookmarkStart w:id="132" w:name="exm-taylor-mv"/>
     <w:p>
       <w:pPr>
         <w:pStyle w:val="FirstParagraph"/>
@@ -28282,7 +28442,7 @@
       <w:r>
         <w:t xml:space="preserve">(</w:t>
       </w:r>
-      <w:hyperlink r:id="rId129">
+      <w:hyperlink r:id="rId130">
         <w:r>
           <w:rPr>
             <w:rStyle w:val="Hyperlink"/>
@@ -28319,7 +28479,7 @@
       <w:r>
         <w:t xml:space="preserve">at every point (</w:t>
       </w:r>
-      <w:hyperlink r:id="rId130">
+      <w:hyperlink r:id="rId131">
         <w:r>
           <w:rPr>
             <w:rStyle w:val="Hyperlink"/>
@@ -28428,8 +28588,8 @@
     $$</w:t>
       </w:r>
     </w:p>
-    <w:bookmarkEnd w:id="131"/>
-    <w:bookmarkStart w:id="132" w:name="def-strict-local-minimizer"/>
+    <w:bookmarkEnd w:id="132"/>
+    <w:bookmarkStart w:id="133" w:name="def-strict-local-minimizer"/>
     <w:p>
       <w:pPr>
         <w:pStyle w:val="FirstParagraph"/>
@@ -28598,8 +28758,8 @@
         <w:t xml:space="preserve">.</w:t>
       </w:r>
     </w:p>
-    <w:bookmarkEnd w:id="132"/>
-    <w:bookmarkStart w:id="133" w:name="exm-strict-local-minimizer"/>
+    <w:bookmarkEnd w:id="133"/>
+    <w:bookmarkStart w:id="134" w:name="exm-strict-local-minimizer"/>
     <w:p>
       <w:pPr>
         <w:pStyle w:val="BodyText"/>
@@ -28978,8 +29138,8 @@
         <w:t xml:space="preserve">never holds.</w:t>
       </w:r>
     </w:p>
-    <w:bookmarkEnd w:id="133"/>
-    <w:bookmarkStart w:id="135" w:name="lem-qf-eigen-bound"/>
+    <w:bookmarkEnd w:id="134"/>
+    <w:bookmarkStart w:id="136" w:name="lem-qf-eigen-bound"/>
     <w:p>
       <w:pPr>
         <w:pStyle w:val="FirstParagraph"/>
@@ -29075,7 +29235,7 @@
       <w:r>
         <w:t xml:space="preserve">(</w:t>
       </w:r>
-      <w:hyperlink r:id="rId134">
+      <w:hyperlink r:id="rId135">
         <w:r>
           <w:rPr>
             <w:rStyle w:val="Hyperlink"/>
@@ -29114,7 +29274,7 @@
         <w:t xml:space="preserve">.</w:t>
       </w:r>
     </w:p>
-    <w:bookmarkEnd w:id="135"/>
+    <w:bookmarkEnd w:id="136"/>
     <w:p>
       <w:pPr>
         <w:pStyle w:val="BodyText"/>
@@ -29291,7 +29451,7 @@
       <w:r>
         <w:t xml:space="preserve">(</w:t>
       </w:r>
-      <w:hyperlink r:id="rId136">
+      <w:hyperlink r:id="rId137">
         <w:r>
           <w:rPr>
             <w:rStyle w:val="Hyperlink"/>
@@ -29357,7 +29517,7 @@
       <w:r>
         <w:t xml:space="preserve"> </w:t>
       </w:r>
-      <w:hyperlink r:id="rId137">
+      <w:hyperlink r:id="rId138">
         <w:r>
           <w:rPr>
             <w:rStyle w:val="Hyperlink"/>
@@ -29377,7 +29537,7 @@
       <w:r>
         <w:t xml:space="preserve"> </w:t>
       </w:r>
-      <w:hyperlink r:id="rId138">
+      <w:hyperlink r:id="rId139">
         <w:r>
           <w:rPr>
             <w:rStyle w:val="Hyperlink"/>
@@ -29530,7 +29690,7 @@
       <w:r>
         <w:t xml:space="preserve">(</w:t>
       </w:r>
-      <w:hyperlink r:id="rId139">
+      <w:hyperlink r:id="rId140">
         <w:r>
           <w:rPr>
             <w:rStyle w:val="Hyperlink"/>
@@ -29542,7 +29702,7 @@
         <w:t xml:space="preserve">).</w:t>
       </w:r>
     </w:p>
-    <w:bookmarkStart w:id="141" w:name="exm-qf-eigen-bound"/>
+    <w:bookmarkStart w:id="142" w:name="exm-qf-eigen-bound"/>
     <w:p>
       <w:pPr>
         <w:pStyle w:val="BodyText"/>
@@ -29659,7 +29819,7 @@
       <w:r>
         <w:t xml:space="preserve">(</w:t>
       </w:r>
-      <w:hyperlink r:id="rId140">
+      <w:hyperlink r:id="rId141">
         <w:r>
           <w:rPr>
             <w:rStyle w:val="Hyperlink"/>
@@ -29799,8 +29959,8 @@
         <w:t xml:space="preserve">.</w:t>
       </w:r>
     </w:p>
-    <w:bookmarkEnd w:id="141"/>
-    <w:bookmarkStart w:id="142" w:name="lem-qf-entry-bound"/>
+    <w:bookmarkEnd w:id="142"/>
+    <w:bookmarkStart w:id="143" w:name="lem-qf-entry-bound"/>
     <w:p>
       <w:pPr>
         <w:pStyle w:val="BodyText"/>
@@ -29934,7 +30094,7 @@
         <w:t xml:space="preserve">.</w:t>
       </w:r>
     </w:p>
-    <w:bookmarkEnd w:id="142"/>
+    <w:bookmarkEnd w:id="143"/>
     <w:p>
       <w:pPr>
         <w:pStyle w:val="BodyText"/>
@@ -30040,7 +30200,7 @@
       <w:r>
         <w:t xml:space="preserve"> </w:t>
       </w:r>
-      <w:hyperlink r:id="rId127">
+      <w:hyperlink r:id="rId128">
         <w:r>
           <w:rPr>
             <w:rStyle w:val="Hyperlink"/>
@@ -30060,7 +30220,7 @@
       <w:r>
         <w:t xml:space="preserve"> </w:t>
       </w:r>
-      <w:hyperlink r:id="rId143">
+      <w:hyperlink r:id="rId144">
         <w:r>
           <w:rPr>
             <w:rStyle w:val="Hyperlink"/>
@@ -30077,7 +30237,7 @@
       <w:r>
         <w:t xml:space="preserve"> </w:t>
       </w:r>
-      <w:hyperlink r:id="rId144">
+      <w:hyperlink r:id="rId145">
         <w:r>
           <w:rPr>
             <w:rStyle w:val="Hyperlink"/>
@@ -30089,7 +30249,7 @@
         <w:t xml:space="preserve">.</w:t>
       </w:r>
     </w:p>
-    <w:bookmarkStart w:id="145" w:name="exm-qf-entry-bound"/>
+    <w:bookmarkStart w:id="146" w:name="exm-qf-entry-bound"/>
     <w:p>
       <w:pPr>
         <w:pStyle w:val="BodyText"/>
@@ -30373,8 +30533,8 @@
         </m:oMath>
       </m:oMathPara>
     </w:p>
-    <w:bookmarkEnd w:id="145"/>
-    <w:bookmarkStart w:id="147" w:name="thm-second-order-condition"/>
+    <w:bookmarkEnd w:id="146"/>
+    <w:bookmarkStart w:id="148" w:name="thm-second-order-condition"/>
     <w:p>
       <w:pPr>
         <w:pStyle w:val="FirstParagraph"/>
@@ -30474,7 +30634,7 @@
       <w:r>
         <w:t xml:space="preserve">(</w:t>
       </w:r>
-      <w:hyperlink r:id="rId122">
+      <w:hyperlink r:id="rId123">
         <w:r>
           <w:rPr>
             <w:rStyle w:val="Hyperlink"/>
@@ -30549,7 +30709,7 @@
       <w:r>
         <w:t xml:space="preserve"> </w:t>
       </w:r>
-      <w:hyperlink r:id="rId146">
+      <w:hyperlink r:id="rId147">
         <w:r>
           <w:rPr>
             <w:rStyle w:val="Hyperlink"/>
@@ -30604,7 +30764,7 @@
         <w:t xml:space="preserve">).</w:t>
       </w:r>
     </w:p>
-    <w:bookmarkEnd w:id="147"/>
+    <w:bookmarkEnd w:id="148"/>
     <w:p>
       <w:pPr>
         <w:pStyle w:val="BodyText"/>
@@ -30654,7 +30814,7 @@
       <w:r>
         <w:t xml:space="preserve">(</w:t>
       </w:r>
-      <w:hyperlink r:id="rId148">
+      <w:hyperlink r:id="rId149">
         <w:r>
           <w:rPr>
             <w:rStyle w:val="Hyperlink"/>
@@ -30732,7 +30892,7 @@
       <w:r>
         <w:t xml:space="preserve">(</w:t>
       </w:r>
-      <w:hyperlink r:id="rId128">
+      <w:hyperlink r:id="rId129">
         <w:r>
           <w:rPr>
             <w:rStyle w:val="Hyperlink"/>
@@ -31223,7 +31383,7 @@
         <w:t xml:space="preserve">).</w:t>
       </w:r>
     </w:p>
-    <w:bookmarkStart w:id="149" w:name="exm-second-order-condition"/>
+    <w:bookmarkStart w:id="150" w:name="exm-second-order-condition"/>
     <w:p>
       <w:pPr>
         <w:pStyle w:val="BodyText"/>
@@ -31587,8 +31747,8 @@
         <w:t xml:space="preserve">).</w:t>
       </w:r>
     </w:p>
-    <w:bookmarkEnd w:id="149"/>
-    <w:bookmarkStart w:id="150" w:name="exm-second-order-inconclusive"/>
+    <w:bookmarkEnd w:id="150"/>
+    <w:bookmarkStart w:id="151" w:name="exm-second-order-inconclusive"/>
     <w:p>
       <w:pPr>
         <w:pStyle w:val="FirstParagraph"/>
@@ -32135,8 +32295,8 @@
         <w:t xml:space="preserve">.</w:t>
       </w:r>
     </w:p>
-    <w:bookmarkEnd w:id="150"/>
-    <w:bookmarkStart w:id="151" w:name="def-local-maximizer"/>
+    <w:bookmarkEnd w:id="151"/>
+    <w:bookmarkStart w:id="152" w:name="def-local-maximizer"/>
     <w:p>
       <w:pPr>
         <w:pStyle w:val="BodyText"/>
@@ -32305,8 +32465,8 @@
         <w:t xml:space="preserve">.</w:t>
       </w:r>
     </w:p>
-    <w:bookmarkEnd w:id="151"/>
-    <w:bookmarkStart w:id="152" w:name="exm-local-maximizer"/>
+    <w:bookmarkEnd w:id="152"/>
+    <w:bookmarkStart w:id="153" w:name="exm-local-maximizer"/>
     <w:p>
       <w:pPr>
         <w:pStyle w:val="BodyText"/>
@@ -32719,8 +32879,8 @@
         <w:t xml:space="preserve">.</w:t>
       </w:r>
     </w:p>
-    <w:bookmarkEnd w:id="152"/>
-    <w:bookmarkStart w:id="153" w:name="def-saddle-point"/>
+    <w:bookmarkEnd w:id="153"/>
+    <w:bookmarkStart w:id="154" w:name="def-saddle-point"/>
     <w:p>
       <w:pPr>
         <w:pStyle w:val="BodyText"/>
@@ -32909,8 +33069,8 @@
         <w:t xml:space="preserve">.</w:t>
       </w:r>
     </w:p>
-    <w:bookmarkEnd w:id="153"/>
-    <w:bookmarkStart w:id="154" w:name="exm-saddle-point"/>
+    <w:bookmarkEnd w:id="154"/>
+    <w:bookmarkStart w:id="155" w:name="exm-saddle-point"/>
     <w:p>
       <w:pPr>
         <w:pStyle w:val="BodyText"/>
@@ -33174,9 +33334,9 @@
         <w:t xml:space="preserve">and it is a saddle point.</w:t>
       </w:r>
     </w:p>
-    <w:bookmarkEnd w:id="154"/>
-    <w:bookmarkStart w:id="168" w:name="refs"/>
-    <w:bookmarkStart w:id="156" w:name="ref-wikipedia_stationary_point"/>
+    <w:bookmarkEnd w:id="155"/>
+    <w:bookmarkStart w:id="169" w:name="refs"/>
+    <w:bookmarkStart w:id="157" w:name="ref-wikipedia_stationary_point"/>
     <w:p>
       <w:pPr>
         <w:pStyle w:val="Bibliography"/>
@@ -33223,7 +33383,7 @@
       <w:r>
         <w:t xml:space="preserve"> </w:t>
       </w:r>
-      <w:hyperlink r:id="rId155">
+      <w:hyperlink r:id="rId156">
         <w:r>
           <w:rPr>
             <w:rStyle w:val="Hyperlink"/>
@@ -33232,8 +33392,8 @@
         </w:r>
       </w:hyperlink>
     </w:p>
-    <w:bookmarkEnd w:id="156"/>
-    <w:bookmarkStart w:id="158" w:name="ref-problifesavercalc"/>
+    <w:bookmarkEnd w:id="157"/>
+    <w:bookmarkStart w:id="159" w:name="ref-problifesavercalc"/>
     <w:p>
       <w:pPr>
         <w:pStyle w:val="Bibliography"/>
@@ -33266,7 +33426,7 @@
       <w:r>
         <w:t xml:space="preserve"> </w:t>
       </w:r>
-      <w:hyperlink r:id="rId157">
+      <w:hyperlink r:id="rId158">
         <w:r>
           <w:rPr>
             <w:rStyle w:val="Hyperlink"/>
@@ -33275,8 +33435,8 @@
         </w:r>
       </w:hyperlink>
     </w:p>
-    <w:bookmarkEnd w:id="158"/>
-    <w:bookmarkStart w:id="160" w:name="ref-zhou2024optim"/>
+    <w:bookmarkEnd w:id="159"/>
+    <w:bookmarkStart w:id="161" w:name="ref-zhou2024optim"/>
     <w:p>
       <w:pPr>
         <w:pStyle w:val="Bibliography"/>
@@ -33308,7 +33468,7 @@
       <w:r>
         <w:t xml:space="preserve"> </w:t>
       </w:r>
-      <w:hyperlink r:id="rId159">
+      <w:hyperlink r:id="rId160">
         <w:r>
           <w:rPr>
             <w:rStyle w:val="Hyperlink"/>
@@ -33317,8 +33477,8 @@
         </w:r>
       </w:hyperlink>
     </w:p>
-    <w:bookmarkEnd w:id="160"/>
-    <w:bookmarkStart w:id="162" w:name="Xa9ec915cd94511c84068c1cc8483385b59fa411"/>
+    <w:bookmarkEnd w:id="161"/>
+    <w:bookmarkStart w:id="163" w:name="Xa9ec915cd94511c84068c1cc8483385b59fa411"/>
     <w:p>
       <w:pPr>
         <w:pStyle w:val="Bibliography"/>
@@ -33365,7 +33525,7 @@
       <w:r>
         <w:t xml:space="preserve"> </w:t>
       </w:r>
-      <w:hyperlink r:id="rId161">
+      <w:hyperlink r:id="rId162">
         <w:r>
           <w:rPr>
             <w:rStyle w:val="Hyperlink"/>
@@ -33374,8 +33534,8 @@
         </w:r>
       </w:hyperlink>
     </w:p>
-    <w:bookmarkEnd w:id="162"/>
-    <w:bookmarkStart w:id="164" w:name="ref-wikipedia_taylors_theorem"/>
+    <w:bookmarkEnd w:id="163"/>
+    <w:bookmarkStart w:id="165" w:name="ref-wikipedia_taylors_theorem"/>
     <w:p>
       <w:pPr>
         <w:pStyle w:val="Bibliography"/>
@@ -33422,7 +33582,7 @@
       <w:r>
         <w:t xml:space="preserve"> </w:t>
       </w:r>
-      <w:hyperlink r:id="rId163">
+      <w:hyperlink r:id="rId164">
         <w:r>
           <w:rPr>
             <w:rStyle w:val="Hyperlink"/>
@@ -33431,8 +33591,8 @@
         </w:r>
       </w:hyperlink>
     </w:p>
-    <w:bookmarkEnd w:id="164"/>
-    <w:bookmarkStart w:id="165" w:name="ref-rudin1976principles"/>
+    <w:bookmarkEnd w:id="165"/>
+    <w:bookmarkStart w:id="166" w:name="ref-rudin1976principles"/>
     <w:p>
       <w:pPr>
         <w:pStyle w:val="Bibliography"/>
@@ -33463,8 +33623,8 @@
         <w:t xml:space="preserve">, 3rd ed. in International series in pure and applied mathematics. New York: McGraw-Hill, 1976.</w:t>
       </w:r>
     </w:p>
-    <w:bookmarkEnd w:id="165"/>
-    <w:bookmarkStart w:id="167" w:name="ref-wikipedia_saddle_point"/>
+    <w:bookmarkEnd w:id="166"/>
+    <w:bookmarkStart w:id="168" w:name="ref-wikipedia_saddle_point"/>
     <w:p>
       <w:pPr>
         <w:pStyle w:val="Bibliography"/>
@@ -33511,7 +33671,7 @@
       <w:r>
         <w:t xml:space="preserve"> </w:t>
       </w:r>
-      <w:hyperlink r:id="rId166">
+      <w:hyperlink r:id="rId167">
         <w:r>
           <w:rPr>
             <w:rStyle w:val="Hyperlink"/>
@@ -33520,9 +33680,9 @@
         </w:r>
       </w:hyperlink>
     </w:p>
-    <w:bookmarkEnd w:id="167"/>
     <w:bookmarkEnd w:id="168"/>
     <w:bookmarkEnd w:id="169"/>
+    <w:bookmarkEnd w:id="170"/>
     <w:sectPr>
       <w:footnotePr>
         <w:numRestart w:val="eachSect"/>

</xml_diff>